<commit_message>
Copy edit both task tables into plainer, more natural prose
Rewrite every description in the requester table and copy edit the service
staff table: shorter sentences, half as many dashed asides, no aphoristic
closers, plain verbs in place of the essayistic register. The front matter
and the note under the requester table get the same treatment.

Nothing about the model changes. The task labels, levels, boundary values,
numbering and ordering are byte for byte what they were, and every fact in
the descriptions - the request types, the scenarios, the evidence a type
needs, the reasons a task exists - is carried across.

Co-Authored-By: Claude Opus 5 <noreply@anthropic.com>
Claude-Session: https://claude.ai/code/session_01WLsq3xx3ZhXwdA9kqWKhWq
</commit_message>
<xml_diff>
--- a/MDPM 883/Milestone 2/PRISM Furniture Request - Task Descriptions (MDPM 883).docx
+++ b/MDPM 883/Milestone 2/PRISM Furniture Request - Task Descriptions (MDPM 883).docx
@@ -110,7 +110,7 @@
           <w:sz w:val="22"/>
           <w:szCs w:val="22"/>
         </w:rPr>
-        <w:t xml:space="preserve">A hierarchical task model has to be readable at a glance, so the label on each node is short. This document removes the ambiguity that brevity creates. It takes every task in both hierarchies of the PRISM Furniture Request task model and sets out what the task involves, why the user performs it, and which side of the product boundary it falls on.</w:t>
+        <w:t xml:space="preserve">A hierarchical task model has to be readable at a glance, so the label on each node is short. This document fills in what that brevity leaves out. It takes every task in both hierarchies of the PRISM Furniture Request task model and says what the task involves, why the user does it, and which side of the product boundary it falls on.</w:t>
       </w:r>
     </w:p>
     <w:p>
@@ -130,7 +130,7 @@
           <w:sz w:val="22"/>
           <w:szCs w:val="22"/>
         </w:rPr>
-        <w:t xml:space="preserve">Each hierarchy is given as a single table. The number shows parentage rather than sequence: 5.6.1 is a decomposition of 5.6 and not the step that follows it, and a requester may well locate the work before settling on the request type. Level 1 tasks are the major subgoals; level 2 and level 3 tasks are their decompositions. Reading downwards, each level answers the question “in order to do this, what do I need or wish to do?”</w:t>
+        <w:t xml:space="preserve">Each hierarchy is set out as one table. The numbering shows parentage rather than sequence: 5.6.1 is part of 5.6 and not the step after it, and a requester may well locate the work before settling on the request type. Level 1 tasks are the major subgoals, and level 2 and level 3 tasks are what those break down into. Read downwards, each level answers the question “in order to do this, what do I need or wish to do?”</w:t>
       </w:r>
     </w:p>
     <w:p>
@@ -150,7 +150,7 @@
           <w:sz w:val="22"/>
           <w:szCs w:val="22"/>
         </w:rPr>
-        <w:t xml:space="preserve">The Task column reproduces the label on the task model board word for word. Only the capitalisation of the first letter has been regularised, and two spellings corrected — “worn out” at 2.1 and “communication” at 5.6.2. Where an earlier draft of this document and the board disagreed about a label, its wording or its place in the hierarchy, the board has been followed.</w:t>
+        <w:t xml:space="preserve">The Task column uses the label from the task model board word for word. The only changes are the capitalisation of the first letter and two spellings, “worn out” at 2.1 and “communication” at 5.6.2. Where an earlier draft of this document and the board disagreed about a label, its wording or where it sat in the hierarchy, the board won.</w:t>
       </w:r>
     </w:p>
     <w:p>
@@ -170,7 +170,7 @@
           <w:sz w:val="22"/>
           <w:szCs w:val="22"/>
         </w:rPr>
-        <w:t xml:space="preserve">The Where performed column records which side of the product boundary a task falls on. </w:t>
+        <w:t xml:space="preserve">The Where performed column says which side of the product boundary a task falls on. </w:t>
       </w:r>
       <w:r>
         <w:rPr>
@@ -196,7 +196,7 @@
           <w:sz w:val="22"/>
           <w:szCs w:val="22"/>
         </w:rPr>
-        <w:t xml:space="preserve"> marks work carried out away from the system, such as judging that a chair is broken; </w:t>
+        <w:t xml:space="preserve"> is work done away from the system, such as judging that a chair is broken. </w:t>
       </w:r>
       <w:r>
         <w:rPr>
@@ -209,7 +209,7 @@
           <w:sz w:val="22"/>
           <w:szCs w:val="22"/>
         </w:rPr>
-        <w:t xml:space="preserve">partly outside</w:t>
+        <w:t xml:space="preserve">Partly outside</w:t>
       </w:r>
       <w:r>
         <w:rPr>
@@ -222,7 +222,7 @@
           <w:sz w:val="22"/>
           <w:szCs w:val="22"/>
         </w:rPr>
-        <w:t xml:space="preserve"> marks work that straddles the boundary, done elsewhere but recorded in the request; </w:t>
+        <w:t xml:space="preserve"> is work done elsewhere but recorded in the request. </w:t>
       </w:r>
       <w:r>
         <w:rPr>
@@ -235,7 +235,7 @@
           <w:sz w:val="22"/>
           <w:szCs w:val="22"/>
         </w:rPr>
-        <w:t xml:space="preserve">in product</w:t>
+        <w:t xml:space="preserve">In product</w:t>
       </w:r>
       <w:r>
         <w:rPr>
@@ -248,7 +248,7 @@
           <w:sz w:val="22"/>
           <w:szCs w:val="22"/>
         </w:rPr>
-        <w:t xml:space="preserve"> marks a task the product has to support directly. Tasks performed outside the product are kept in the model because they show how users reach their goal as they move between the product and other tools, and because the product must be able to record what they conclude.</w:t>
+        <w:t xml:space="preserve"> is a task the product has to support directly. Tasks done outside are still in the model, because they show how people reach their goal as they move between the product and other tools, and because the product has to be able to record what they conclude.</w:t>
       </w:r>
     </w:p>
     <w:p>
@@ -288,7 +288,7 @@
           <w:sz w:val="22"/>
           <w:szCs w:val="22"/>
         </w:rPr>
-        <w:t xml:space="preserve">The tasks below correspond to section 4.2 of the Requirements Documents deliverable and to the requester hierarchy on the task model board. They describe the work of a Client Ministry Accommodation Contact or other authorized requester, from being able to use the service at all through to confirming that the result was satisfactory. The goal decomposes into six subgoals: getting set up on the system, understanding the furniture need, locating where the work needs to be done, preparing and submitting the request, following it, and completing and closing it.</w:t>
+        <w:t xml:space="preserve">The tasks below correspond to section 4.2 of the Requirements Documents deliverable and to the requester hierarchy on the task model board. They cover the work of a Client Ministry Accommodation Contact or other authorized requester, from being able to use the service at all through to confirming that the result was satisfactory. The goal breaks into six subgoals: getting set up on the system, understanding the furniture need, locating where the work needs to be done, preparing and submitting the request, following it, and completing and closing it.</w:t>
       </w:r>
     </w:p>
     <w:tbl>
@@ -623,7 +623,7 @@
                 <w:sz w:val="20"/>
                 <w:szCs w:val="20"/>
               </w:rPr>
-              <w:t xml:space="preserve">The requester’s overall goal: to turn a furniture need in their office into furniture that is in place, in the right room, and working. Everything below is performed in service of this goal. The hierarchy is a decomposition and not a sequence — a requester may locate the work before deciding on the request type — and the goal is complete only when the requester has seen the result and accepted it, not when Infrastructure marks the work done.</w:t>
+              <w:t xml:space="preserve">The requester wants a furniture need in their office turned into furniture that is in place and working. Everything below is done in service of that. The hierarchy is a decomposition rather than a sequence, so a requester may well locate the work before settling on the request type, and the goal is finished only when the requester has seen the result and accepted it, not when Infrastructure marks the work done.</w:t>
             </w:r>
           </w:p>
         </w:tc>
@@ -780,7 +780,7 @@
                 <w:sz w:val="20"/>
                 <w:szCs w:val="20"/>
               </w:rPr>
-              <w:t xml:space="preserve">Everything a requester must do before they are able to raise a request at all: knowing that this service is the right one, holding credentials for it, and understanding the language the form uses. For a frequent requester such as Priya this is done once and never thought about again; for a once-a-year requester it is a real and recurring obstacle, because access, terminology and even the identity of the right portal have to be re-established each time. It is modelled as a subgoal in its own right because a request that is never started is invisible to the service and cannot be measured.</w:t>
+              <w:t xml:space="preserve">Everything a requester has to sort out before they can raise a request at all: knowing this is the right service, having credentials for it, and understanding the language the form uses. Someone who requests often does this once and never thinks about it again. Someone who requests once a year has to re-establish all three each time, which is why it is a subgoal in its own right — a request that never gets started is invisible to the service.</w:t>
             </w:r>
           </w:p>
         </w:tc>
@@ -932,7 +932,7 @@
                 <w:sz w:val="20"/>
                 <w:szCs w:val="20"/>
               </w:rPr>
-              <w:t xml:space="preserve">Establishing that a furniture need is handled through the Furniture Request service rather than through another channel such as a maintenance request, a procurement process, a service desk ticket or an email to a facilities contact. Occasional requesters frequently start in the wrong place and lose days before they are redirected. The product’s part is to be findable and to say plainly, at its entry point, what it is for and what it is not for.</w:t>
+              <w:t xml:space="preserve">Working out that a furniture need goes through the Furniture Request service and not somewhere else, such as a maintenance request, a procurement process, a service desk ticket or an email to a facilities contact. Occasional requesters often start in the wrong place and lose days before someone redirects them. The product’s part is to be easy to find and to say plainly, at its front door, what it covers and what it does not.</w:t>
             </w:r>
           </w:p>
         </w:tc>
@@ -1084,7 +1084,7 @@
                 <w:sz w:val="20"/>
                 <w:szCs w:val="20"/>
               </w:rPr>
-              <w:t xml:space="preserve">Getting working credentials and reaching the point at which a request can be started, whether that means signing in with an existing government account or being granted access for the first time. Most of the work happens outside the product, in an access process the requester does not control, but its difficulty directly affects whether an infrequent requester gets started at all — and a failed sign-in is indistinguishable, from where the requester stands, from the service being unavailable.</w:t>
+              <w:t xml:space="preserve">Getting credentials that work and reaching the point where a request can be started, either by signing in with an existing government account or by being granted access for the first time. Most of this happens outside the product, in an access process the requester does not control. It still belongs here, because a requester who cannot sign in has no way of telling that apart from the service being down.</w:t>
             </w:r>
           </w:p>
         </w:tc>
@@ -1236,7 +1236,7 @@
                 <w:sz w:val="20"/>
                 <w:szCs w:val="20"/>
               </w:rPr>
-              <w:t xml:space="preserve">Working out what the request is actually asking for: what a work order is, what distinguishes a modification from a repair, what counts as a building code, what the service means by a planning request. Requesters are administrative staff with no facilities background, and the vocabulary belongs to Infrastructure rather than to them. This task is the reason the product has to explain its own terms at the point of use instead of assuming them.</w:t>
+              <w:t xml:space="preserve">Working out what the form is actually asking for: what a work order is, how a modification differs from a repair, what counts as a building code, what the service means by a planning request. Requesters are administrative staff without a facilities background, so the vocabulary belongs to Infrastructure rather than to them. The product has to explain its own terms where they are used instead of assuming them.</w:t>
             </w:r>
           </w:p>
         </w:tc>
@@ -1388,7 +1388,7 @@
                 <w:sz w:val="20"/>
                 <w:szCs w:val="20"/>
               </w:rPr>
-              <w:t xml:space="preserve">Consulting the guidance attached to a field at the moment of filling it in, rather than reading documentation beforehand. This is the requester’s preferred way of resolving uncertainty because it costs nothing when it is not needed and appears exactly where the doubt arises. It also governs the quality of what is submitted: the fields that are explained are the fields that come back complete.</w:t>
+              <w:t xml:space="preserve">Checking the guidance attached to a field while filling it in, rather than reading documentation first. Requesters prefer this because it costs nothing when it is not needed and it appears exactly where the doubt is. It also shows in what gets submitted: the fields that are explained are the ones that come back complete.</w:t>
             </w:r>
           </w:p>
         </w:tc>
@@ -1545,7 +1545,7 @@
                 <w:sz w:val="20"/>
                 <w:szCs w:val="20"/>
               </w:rPr>
-              <w:t xml:space="preserve">Establishing what is actually required before anything is entered anywhere. The CMAC is usually relaying a need reported by someone else — a manager, a new employee, a colleague with a broken chair — so this subgoal is largely a conversation and an inspection carried out away from any screen. The product cannot perform it, but every conclusion reached here becomes a field on the request, so the product must be able to record those conclusions without requiring that they were reached in a particular order.</w:t>
+              <w:t xml:space="preserve">Working out what is actually needed before anything is typed in. The CMAC is usually relaying a problem someone else reported, so most of this is a conversation and a look at the furniture, away from any screen. The product cannot do the thinking, but each conclusion ends up as a field on the request, so it has to record them without insisting they were reached in a particular order.</w:t>
             </w:r>
           </w:p>
         </w:tc>
@@ -1697,7 +1697,7 @@
                 <w:sz w:val="20"/>
                 <w:szCs w:val="20"/>
               </w:rPr>
-              <w:t xml:space="preserve">Judging whether an item is broken, worn out, unsuitable for the person using it, or simply absent because a new person has arrived. The judgement is made by looking at the furniture, and it is the first fork in the model: it decides whether repair, warranty, replacement or new purchase is the appropriate path, and therefore what evidence will be needed. A photograph or a short video taken at this moment is what later settles any disagreement about what was wrong.</w:t>
+              <w:t xml:space="preserve">Judging whether an item is broken, worn out, unsuitable for the person using it, or simply missing because someone new has arrived. It is a judgement made by looking at the furniture, and it is the first fork in the model: it decides whether the answer is a repair, a warranty claim, a replacement or a new purchase, and therefore what evidence the request will need. A photograph or a short video taken at this point is what later settles any argument about what was wrong.</w:t>
             </w:r>
           </w:p>
         </w:tc>
@@ -1849,7 +1849,7 @@
                 <w:sz w:val="20"/>
                 <w:szCs w:val="20"/>
               </w:rPr>
-              <w:t xml:space="preserve">Selecting among the supported request types — new purchase, planning, modification, repair and warranty — because each requires different supporting information and follows a different fulfilment path once it reaches Infrastructure. The requester makes the judgement outside the product but records it in the request, and choosing wrongly is expensive: it sends the request to the wrong group, and the error is usually discovered only when a coordinator opens it.</w:t>
+              <w:t xml:space="preserve">Choosing among the request types the service supports: new purchase, planning, modification, repair and warranty. Each one needs different supporting information and takes a different route once it reaches Infrastructure. The requester decides outside the product and records the decision in the request. Choosing wrongly sends the request to the wrong group, and that usually only comes to light when a coordinator opens it.</w:t>
             </w:r>
           </w:p>
         </w:tc>
@@ -2001,7 +2001,7 @@
                 <w:sz w:val="20"/>
                 <w:szCs w:val="20"/>
               </w:rPr>
-              <w:t xml:space="preserve">Deciding whether the request serves one person’s workstation or a shared area such as a meeting room, a reception or a floor being reconfigured. This changes the quantity, the approval path and often the urgency, and it changes who has to be consulted before the request is raised. It is kept as a task in its own right because requesters routinely submit for one person what is in fact an area-wide need, and the correction costs a cycle.</w:t>
+              <w:t xml:space="preserve">Deciding whether the request is for one person’s workstation or for a shared area such as a meeting room, a reception or a floor being reconfigured. That changes the quantity, the approval path and often the urgency, and it changes who has to be consulted first. It is kept as its own task because requesters regularly submit as one person’s problem what is really an area-wide one, and putting that right costs a cycle.</w:t>
             </w:r>
           </w:p>
         </w:tc>
@@ -2153,7 +2153,7 @@
                 <w:sz w:val="20"/>
                 <w:szCs w:val="20"/>
               </w:rPr>
-              <w:t xml:space="preserve">Establishing whether the need can be met from government furniture already in stock before a purchase is considered. This is both a cost decision and a stated policy preference, and the requester needs it resolved early because it changes what they must supply: a recycled item needs dimensions and a location, a new one may need a quote and an approval. The product’s role is to let the preference be stated on the request and kept visible to the coordinator who acts on it.</w:t>
+              <w:t xml:space="preserve">Establishing whether the need can be met from government furniture already in stock before anyone considers buying. It is a cost decision and a stated policy preference at the same time, and the requester needs it settled early because it changes what they have to supply: a recycled item needs dimensions and a location, a new one may need a quote and an approval. The product’s job is to carry the preference on the request and keep it in front of the coordinator who acts on it.</w:t>
             </w:r>
           </w:p>
         </w:tc>
@@ -2305,7 +2305,7 @@
                 <w:sz w:val="20"/>
                 <w:szCs w:val="20"/>
               </w:rPr>
-              <w:t xml:space="preserve">Finding out whether a suitable item exists in the recycle program — the right type, the right quantity, in reasonable condition, available when it is needed. Today this generally means asking someone and waiting for an answer that arrives by email. The product’s role is to let the preference be expressed and the answer be recorded against the request, so that the reason a request went to purchase is part of its history rather than a recollection.</w:t>
+              <w:t xml:space="preserve">Finding out whether the recycle program has something suitable: the right type, the right quantity, in reasonable condition, available when it is needed. In practice this means asking someone and waiting for an answer by email. The product should let the preference be stated and the answer be written back to the request, so the reason a request went to purchase stays on the record instead of in someone’s memory.</w:t>
             </w:r>
           </w:p>
         </w:tc>
@@ -2457,7 +2457,7 @@
                 <w:sz w:val="20"/>
                 <w:szCs w:val="20"/>
               </w:rPr>
-              <w:t xml:space="preserve">Looking for an open request covering the same need before submitting a new one. This is the requester’s own defence against creating a duplicate, and it fails today because a requester cannot see requests raised by other authorized requesters for the same area — which is exactly how Owen’s duplicate in the scenarios arises. Supporting it means letting a requester search the requests for the buildings they are responsible for, not only the ones they submitted themselves.</w:t>
+              <w:t xml:space="preserve">Looking for an open request covering the same need before raising another one. This is the requester’s own defence against duplicates, and it does not work today, because a requester cannot see requests raised by other authorized requesters for the same area. That is how Owen ends up with two requests for one chair. Supporting it means letting a requester search the requests for the buildings they look after, not only their own.</w:t>
             </w:r>
           </w:p>
         </w:tc>
@@ -2609,7 +2609,7 @@
                 <w:sz w:val="20"/>
                 <w:szCs w:val="20"/>
               </w:rPr>
-              <w:t xml:space="preserve">Finding the original request for an existing item in order to establish whether it is still under warranty and what exactly was supplied: manufacturer, model, finish, dimensions, and the purchase and installation dates. This is the task that makes a closed request valuable years after it closed, and it is why history sits inside the requester’s goal rather than being treated as finished business. Without it, a replacement part is ordered by approximation, or a valid warranty claim is never made at all.</w:t>
+              <w:t xml:space="preserve">Finding the original request for an item already in place, to work out whether it is still under warranty and what exactly was supplied: manufacturer, model, finish, dimensions, and the purchase and installation dates. This is what makes a closed request worth keeping years later, and it is why history sits inside the requester’s goal rather than being treated as finished business. Without it, a replacement part gets ordered by guesswork, or a valid warranty claim never gets made.</w:t>
             </w:r>
           </w:p>
         </w:tc>
@@ -2766,7 +2766,7 @@
                 <w:sz w:val="20"/>
                 <w:szCs w:val="20"/>
               </w:rPr>
-              <w:t xml:space="preserve">Describing the place precisely enough that furniture arrives in the right room. Vagueness here is the single most common cause of the delivery errors the scenarios describe, and the cost is paid twice — once in the wrong delivery and again in the move that corrects it. The model decomposes this subgoal further than its apparent simplicity suggests, because building, address, floor, area and plan each fail independently of the others.</w:t>
+              <w:t xml:space="preserve">Describing the place precisely enough that the furniture arrives in the right room. Vagueness here causes most of the delivery errors the scenarios describe, and each one is paid for twice: once in the wrong delivery and again in the move that fixes it. The model breaks this down further than it might seem to need, because the building, the address, the floor, the area and the plan each go wrong on their own.</w:t>
             </w:r>
           </w:p>
         </w:tc>
@@ -2918,7 +2918,7 @@
                 <w:sz w:val="20"/>
                 <w:szCs w:val="20"/>
               </w:rPr>
-              <w:t xml:space="preserve">Selecting the Government of Alberta facility from the buildings the requester is authorized for. The building is the anchor for the rest of the location data — the address, the available floor plans and the responsible service group all follow from it — which is why it is chosen from a known list rather than typed.</w:t>
+              <w:t xml:space="preserve">Picking the Government of Alberta facility from the buildings the requester is authorized for. Everything else about the location hangs off it: the address, the floor plans that exist, and the service group responsible. That is why it is chosen from a list rather than typed.</w:t>
             </w:r>
           </w:p>
         </w:tc>
@@ -3070,7 +3070,7 @@
                 <w:sz w:val="20"/>
                 <w:szCs w:val="20"/>
               </w:rPr>
-              <w:t xml:space="preserve">Confirming the street address that follows from the selected building rather than typing it again. The requester is verifying, not entering: this is faster for them and it is the only way the address on the request can be trusted to match the facility record it came from.</w:t>
+              <w:t xml:space="preserve">Confirming the street address that comes with the building rather than typing it again. The requester is checking, not entering, which is quicker for them and the only way the address on the request can be trusted to match the facility record it came from.</w:t>
             </w:r>
           </w:p>
         </w:tc>
@@ -3222,7 +3222,7 @@
                 <w:sz w:val="20"/>
                 <w:szCs w:val="20"/>
               </w:rPr>
-              <w:t xml:space="preserve">Narrowing the location to a floor and to an area, room or workstation within it. This is the level of precision the delivery and installation teams actually need, and it is where Daniel’s incomplete request in the scenarios breaks down: a named floor with no named area cannot be assigned to an installer, however complete the rest of the request may be.</w:t>
+              <w:t xml:space="preserve">Narrowing the location to a floor and then to an area, room or workstation on it. This is the precision the delivery and installation teams actually work to, and it is where Daniel’s incomplete request falls over: a floor with no area named cannot be given to an installer, however complete the rest of the request is.</w:t>
             </w:r>
           </w:p>
         </w:tc>
@@ -3374,7 +3374,7 @@
                 <w:sz w:val="20"/>
                 <w:szCs w:val="20"/>
               </w:rPr>
-              <w:t xml:space="preserve">Supplying a visual record of exactly where the furniture goes, marked on a plan of the area. This is how a requester communicates a spatial arrangement that words handle badly — which wall, which side of the partition, which of four identical workstations — and it matters most for moves and reconfigurations, where both where the furniture is coming from and where it is going have to be shown.</w:t>
+              <w:t xml:space="preserve">Showing exactly where the furniture goes by marking it on a plan of the area. Words handle this badly — which wall, which side of the partition, which of four identical workstations — and a marked plan settles it. It matters most for moves and reconfigurations, where both where the furniture is coming from and where it is going have to be shown.</w:t>
             </w:r>
           </w:p>
         </w:tc>
@@ -3526,7 +3526,7 @@
                 <w:sz w:val="20"/>
                 <w:szCs w:val="20"/>
               </w:rPr>
-              <w:t xml:space="preserve">Using a plan already held for the facility, which is faster than producing one and more accurate, because it is the plan the installers already work from. The board shows this and the sketch below as siblings: they are alternative ways of accomplishing the same parent task, not successive steps.</w:t>
+              <w:t xml:space="preserve">Using a plan the facility already has. It is quicker than making one and more accurate, because it is the plan the installers work from. The board shows this and the sketch beside it as siblings: they are two ways of doing the same parent task, not two steps.</w:t>
             </w:r>
           </w:p>
         </w:tc>
@@ -3678,7 +3678,7 @@
                 <w:sz w:val="20"/>
                 <w:szCs w:val="20"/>
               </w:rPr>
-              <w:t xml:space="preserve">Drawing the area by hand, or photographing it, when no plan is held. The alternative path exists because plans are not maintained for every area and a request must not stall for want of one; a sketch photographed on a phone and attached is usually enough for an installer who also has the floor and area fields to work from.</w:t>
+              <w:t xml:space="preserve">Drawing the area by hand or photographing it when no plan is held. Plans are not kept for every area and a request should not stall for want of one, so a sketch photographed on a phone and attached will do, especially alongside the floor and area fields.</w:t>
             </w:r>
           </w:p>
         </w:tc>
@@ -3835,7 +3835,7 @@
                 <w:sz w:val="20"/>
                 <w:szCs w:val="20"/>
               </w:rPr>
-              <w:t xml:space="preserve">Assembling everything gathered so far into a request and sending it to Infrastructure. This is where the requester’s work first becomes visible to the service, and where completeness matters most: every omission here becomes a question later, and every question adds a round trip that the requester experiences as delay and the coordinator experiences as queue.</w:t>
+              <w:t xml:space="preserve">Putting everything gathered so far into a request and sending it to Infrastructure. This is where the requester’s work first becomes visible to the service, and where completeness counts most: anything left out turns into a question later, and every question adds a round trip that the requester feels as delay and the coordinator sees as queue.</w:t>
             </w:r>
           </w:p>
         </w:tc>
@@ -3987,7 +3987,7 @@
                 <w:sz w:val="20"/>
                 <w:szCs w:val="20"/>
               </w:rPr>
-              <w:t xml:space="preserve">Recording the need, the request type, the location, the quantities, the priority and the reason for the request in the form the process requires. The form is the requester’s account of the need, and it has to be fillable by someone who does this once a year, in one sitting, without training.</w:t>
+              <w:t xml:space="preserve">Recording the need, the request type, the location, the quantities, the priority and the reason for the request. The form is the requester’s account of the problem, and it has to be fillable in one sitting by someone who does this once a year and has had no training.</w:t>
             </w:r>
           </w:p>
         </w:tc>
@@ -4139,7 +4139,7 @@
                 <w:sz w:val="20"/>
                 <w:szCs w:val="20"/>
               </w:rPr>
-              <w:t xml:space="preserve">Adding the photographs, plans, quotes, approvals and checklists that show what is needed. Attachments carry much of the meaning of a furniture request, because a photograph settles in one glance questions that a written description leaves open, and because they are the part of the request that survives translation between the requester’s vocabulary and Infrastructure’s.</w:t>
+              <w:t xml:space="preserve">Adding the photographs, plans, quotes, approvals and checklists that show what is needed. Attachments carry a lot of the meaning of a furniture request: a photograph answers in a glance what a written description leaves open, and it survives the translation between the requester’s words and Infrastructure’s.</w:t>
             </w:r>
           </w:p>
         </w:tc>
@@ -4291,7 +4291,7 @@
                 <w:sz w:val="20"/>
                 <w:szCs w:val="20"/>
               </w:rPr>
-              <w:t xml:space="preserve">Adding several files in a single action rather than one at a time. This matters because a typical request carries a marked plan, several photographs and an approval, and a one-at-a-time upload is the point at which a requester decides that three photographs will do instead of six.</w:t>
+              <w:t xml:space="preserve">Adding several files in one go instead of one at a time. A typical request carries a marked plan, a few photographs and an approval, and a one-at-a-time upload is the point where a requester decides that three photographs will do instead of six.</w:t>
             </w:r>
           </w:p>
         </w:tc>
@@ -4443,7 +4443,7 @@
                 <w:sz w:val="20"/>
                 <w:szCs w:val="20"/>
               </w:rPr>
-              <w:t xml:space="preserve">Capturing the problem where it is, when it is noticed, and attaching it without first moving the image to a desktop. This is the reason the product has to be usable on a phone: the requester is standing in front of the broken chair at the moment they know most about it, and anything that defers the capture loses detail.</w:t>
+              <w:t xml:space="preserve">Taking the photograph where the problem is, when it is noticed, and attaching it without moving it to a desktop first. This is why the product has to work on a phone: the requester knows most about the problem while standing in front of it, and anything that defers the photo loses detail.</w:t>
             </w:r>
           </w:p>
         </w:tc>
@@ -4595,7 +4595,7 @@
                 <w:sz w:val="20"/>
                 <w:szCs w:val="20"/>
               </w:rPr>
-              <w:t xml:space="preserve">Showing a fault that a still photograph cannot convey — a sit-stand desk that stops partway through raising, a chair mechanism that gives way under load, a drawer that jams. A few seconds of video removes an entire exchange of clarifying questions and often decides whether the fault is handled as a warranty claim or as a repair.</w:t>
+              <w:t xml:space="preserve">Showing a fault a still photograph cannot: a sit-stand desk that stops partway through raising, a chair mechanism that gives way under load, a drawer that jams. A few seconds of video saves a whole exchange of clarifying questions, and it often decides whether the fault is treated as a warranty claim or a repair.</w:t>
             </w:r>
           </w:p>
         </w:tc>
@@ -4747,7 +4747,7 @@
                 <w:sz w:val="20"/>
                 <w:szCs w:val="20"/>
               </w:rPr>
-              <w:t xml:space="preserve">Naming attachments so that a coordinator, or the requester two years later, can tell what each one shows without opening all of them. Unlabelled files are the reason attachments stop being evidence and become clutter, and labelling is the cheapest available defence against that.</w:t>
+              <w:t xml:space="preserve">Naming attachments so a coordinator, or the requester two years later, can tell what each one shows without opening all of them. Unlabelled files are how attachments stop being evidence and turn into clutter, and labelling is the cheapest way to prevent it.</w:t>
             </w:r>
           </w:p>
         </w:tc>
@@ -4899,7 +4899,7 @@
                 <w:sz w:val="20"/>
                 <w:szCs w:val="20"/>
               </w:rPr>
-              <w:t xml:space="preserve">Setting a part-finished request aside and returning to it. Requesters are routinely interrupted and frequently have to go and find a piece of information — a floor plan, a quantity, an approval — before they can continue, so a request that cannot be paused is a request that gets abandoned and started again from nothing.</w:t>
+              <w:t xml:space="preserve">Putting a part-finished request aside and coming back to it. Requesters get interrupted, and they often have to go and find something — a floor plan, a quantity, an approval — before they can carry on. A request that cannot be paused is one that gets abandoned and started again from scratch.</w:t>
             </w:r>
           </w:p>
         </w:tc>
@@ -5051,7 +5051,7 @@
                 <w:sz w:val="20"/>
                 <w:szCs w:val="20"/>
               </w:rPr>
-              <w:t xml:space="preserve">Sending the completed request for review in one deliberate action, without a separate status change the requester has to remember to make. Submission is also the moment at which ownership passes to Infrastructure, so it has to be unambiguous to both sides.</w:t>
+              <w:t xml:space="preserve">Sending the finished request for review in one deliberate action, with no separate status change to remember. Submitting also hands ownership to Infrastructure, so both sides need to be clear that it has happened.</w:t>
             </w:r>
           </w:p>
         </w:tc>
@@ -5203,7 +5203,7 @@
                 <w:sz w:val="20"/>
                 <w:szCs w:val="20"/>
               </w:rPr>
-              <w:t xml:space="preserve">Getting unambiguous acknowledgement that the request was received, with a reference the requester can quote. This closes the loop that currently causes infrequent requesters to submit a second request out of uncertainty, which is one of the two routes by which duplicates enter the system.</w:t>
+              <w:t xml:space="preserve">Getting a clear acknowledgement that the request arrived, with a reference the requester can quote. This closes the loop that currently has infrequent requesters submitting a second request because they are not sure the first one landed, which is one of the two ways duplicates get in.</w:t>
             </w:r>
           </w:p>
         </w:tc>
@@ -5355,7 +5355,7 @@
                 <w:sz w:val="20"/>
                 <w:szCs w:val="20"/>
               </w:rPr>
-              <w:t xml:space="preserve">Reviewing the assembled request against what the chosen request type requires — the marked plan a reconfiguration needs, the approval a purchase needs, the product detail a warranty claim needs — before it is sent. On the board this task sits at the end of the branch because that is where the requester usually discovers it was needed; the product’s job is to move the discovery earlier, by saying what is missing while the request can still be corrected without a round trip through a coordinator.</w:t>
+              <w:t xml:space="preserve">Going over the assembled request against what the chosen request type needs: the marked plan for a reconfiguration, the approval for a purchase, the product detail for a warranty claim. On the board the task sits at the end of the branch, which is where requesters usually discover it mattered. The product’s job is to move that discovery earlier, by saying what is missing while the request can still be fixed without going through a coordinator.</w:t>
             </w:r>
           </w:p>
         </w:tc>
@@ -5512,7 +5512,7 @@
                 <w:sz w:val="20"/>
                 <w:szCs w:val="20"/>
               </w:rPr>
-              <w:t xml:space="preserve">Everything the requester does between submission and completion. This subgoal is the heart of the problem statement: today it is accomplished through email, telephone calls and memory rather than through any system, which means a requester’s knowledge of their own request is only as good as their inbox and is lost entirely while they are away.</w:t>
+              <w:t xml:space="preserve">Everything the requester does between submitting and completion. This subgoal is the heart of the problem statement: it runs on email, phone calls and memory rather than on any system, so a requester’s knowledge of their own request is only as good as their inbox, and it disappears entirely while they are away.</w:t>
             </w:r>
           </w:p>
         </w:tc>
@@ -5664,7 +5664,7 @@
                 <w:sz w:val="20"/>
                 <w:szCs w:val="20"/>
               </w:rPr>
-              <w:t xml:space="preserve">Establishing what state the request is in — created, submitted, assigned, in progress, completed — without asking anyone. This is the smallest useful thing the product can offer a requester and the one most likely to remove an enquiry.</w:t>
+              <w:t xml:space="preserve">Finding out what state the request is in — created, submitted, assigned, in progress, completed — without asking anyone. It is the smallest useful thing the product can give a requester, and the one most likely to remove a phone call.</w:t>
             </w:r>
           </w:p>
         </w:tc>
@@ -5816,7 +5816,7 @@
                 <w:sz w:val="20"/>
                 <w:szCs w:val="20"/>
               </w:rPr>
-              <w:t xml:space="preserve">Understanding not merely the status label but what is happening now, who is doing it and what happens next. This is what a requester actually needs in order to answer the manager who asked them, and a status alone rarely answers it: “in progress” does not distinguish a request waiting on a quote from one waiting on a delivery date.</w:t>
+              <w:t xml:space="preserve">Understanding what is happening now, who has the request and what happens next, rather than just reading a status label. This is what a requester needs in order to answer the manager who asked them, and a label rarely does it: “in progress” does not say whether the request is waiting on a quote or on a delivery date.</w:t>
             </w:r>
           </w:p>
         </w:tc>
@@ -5968,7 +5968,7 @@
                 <w:sz w:val="20"/>
                 <w:szCs w:val="20"/>
               </w:rPr>
-              <w:t xml:space="preserve">Seeing how far an external supplier, mover or installer has got — ordered, shipped, scheduled, installed — without the supplier having to work in the system. External parties do not transact here, so this information reaches the request through the staff who deal with them, and the task exists to make sure it arrives there at all.</w:t>
+              <w:t xml:space="preserve">Seeing how far an outside supplier, mover or installer has got: ordered, shipped, scheduled, installed. Suppliers do not work in the system, so this reaches the request through the staff who deal with them, and the task is here to make sure it gets there at all.</w:t>
             </w:r>
           </w:p>
         </w:tc>
@@ -6120,7 +6120,7 @@
                 <w:sz w:val="20"/>
                 <w:szCs w:val="20"/>
               </w:rPr>
-              <w:t xml:space="preserve">Judging whether silence means normal progress or a problem. This judgement triggers every follow-up the requester makes and is currently made on instinct, from how long it has been and what happened last time. Showing the stage, the date of the last change and the expected next step turns the guess into a decision, and it is what allows an experienced requester such as Priya to leave most of her requests alone.</w:t>
+              <w:t xml:space="preserve">Working out whether silence means things are moving normally or that something has gone wrong. This judgement sets off every follow-up a requester makes, and today it is made on instinct, from how long it has been and what happened last time. Showing the stage, when it last changed and what is expected next turns the guess into a decision, and it is what lets Priya leave most of her requests alone.</w:t>
             </w:r>
           </w:p>
         </w:tc>
@@ -6272,7 +6272,7 @@
                 <w:sz w:val="20"/>
                 <w:szCs w:val="20"/>
               </w:rPr>
-              <w:t xml:space="preserve">Being told when something changes rather than having to go and check. The requester’s goal here is to be able to stop watching: to know that if anything happens they will hear about it, and therefore that no news genuinely means no change.</w:t>
+              <w:t xml:space="preserve">Being told when something changes instead of going to look. What the requester really wants is to stop watching: to know that if anything happens they will hear about it, so that no news means nothing has happened.</w:t>
             </w:r>
           </w:p>
         </w:tc>
@@ -6424,7 +6424,7 @@
                 <w:sz w:val="20"/>
                 <w:szCs w:val="20"/>
               </w:rPr>
-              <w:t xml:space="preserve">Being alerted promptly when the change is one that requires the requester to act — a question from a coordinator, a scheduled delivery date, an approval that is needed. Notifications that arrive for everything get turned off, so the ones that matter have to be distinguishable from the ones that do not.</w:t>
+              <w:t xml:space="preserve">Being told promptly when the change needs something from the requester: a question from a coordinator, a delivery date to arrange access for, an approval that is waiting. Notifications that fire for everything get switched off, so the ones that matter have to look different from the ones that do not.</w:t>
             </w:r>
           </w:p>
         </w:tc>
@@ -6576,7 +6576,7 @@
                 <w:sz w:val="20"/>
                 <w:szCs w:val="20"/>
               </w:rPr>
-              <w:t xml:space="preserve">Supplying what a coordinator has asked for — a marked plan, a quantity, a product detail, a confirmation — and supplying it against the request rather than by return email. This is the requester’s half of Daniel’s scenario, and it is the point at which a request either becomes actionable or goes back into a queue.</w:t>
+              <w:t xml:space="preserve">Supplying what a coordinator has asked for — a marked plan, a quantity, a product detail, a confirmation — and supplying it on the request rather than by return email. This is the requester’s half of Daniel’s scenario, and it is where a request either becomes workable or goes back into the queue.</w:t>
             </w:r>
           </w:p>
         </w:tc>
@@ -6728,7 +6728,7 @@
                 <w:sz w:val="20"/>
                 <w:szCs w:val="20"/>
               </w:rPr>
-              <w:t xml:space="preserve">Conducting the conversation that a request generates — questions, clarifications, corrections and agreement about what was actually meant — in a way that stays attached to the request instead of dispersing into mail, Teams messages and telephone calls.</w:t>
+              <w:t xml:space="preserve">Having the conversation a request generates — questions, clarifications, corrections, agreeing what was actually meant — in a way that stays with the request instead of spreading across email, Teams and phone calls.</w:t>
             </w:r>
           </w:p>
         </w:tc>
@@ -6880,7 +6880,7 @@
                 <w:sz w:val="20"/>
                 <w:szCs w:val="20"/>
               </w:rPr>
-              <w:t xml:space="preserve">Getting to whoever currently owns the request rather than to whoever answered last time. Ownership changes at every handoff between service groups, and the requester has no way of knowing that it has changed, so they write to the last name they have and wait.</w:t>
+              <w:t xml:space="preserve">Getting to whoever holds the request now rather than whoever answered last time. Ownership changes at every handoff between service groups, and the requester has no way of knowing it has changed, so they write to the last name they have and wait.</w:t>
             </w:r>
           </w:p>
         </w:tc>
@@ -7032,7 +7032,7 @@
                 <w:sz w:val="20"/>
                 <w:szCs w:val="20"/>
               </w:rPr>
-              <w:t xml:space="preserve">Ensuring that what was asked, answered and decided is recorded against the request rather than in a private mailbox. This is what lets the request survive the requester’s absence, lets the next coordinator see why a decision was made, and is the difference between a record and a correspondence.</w:t>
+              <w:t xml:space="preserve">Making sure what was asked, answered and decided is written on the request rather than kept in a private mailbox. That is what lets the request survive the requester’s absence, and it lets the next coordinator see why a decision was made.</w:t>
             </w:r>
           </w:p>
         </w:tc>
@@ -7184,7 +7184,7 @@
                 <w:sz w:val="20"/>
                 <w:szCs w:val="20"/>
               </w:rPr>
-              <w:t xml:space="preserve">Escalating when nothing has moved: telephoning, emailing, and asking someone to find out where the request has got to. This task should become rare if the rest of the model works, and its frequency is a fair measure of whether the product has succeeded.</w:t>
+              <w:t xml:space="preserve">Escalating when nothing has moved: phoning, emailing, asking someone to find out where the request has got to. If the rest of the model works this should become rare, and how often it happens is a fair measure of whether the product has succeeded.</w:t>
             </w:r>
           </w:p>
         </w:tc>
@@ -7336,7 +7336,7 @@
                 <w:sz w:val="20"/>
                 <w:szCs w:val="20"/>
               </w:rPr>
-              <w:t xml:space="preserve">Checking the delivered result against what was asked for — the right items, the right quantity, the right room, assembled and working — and acting on any difference. The check itself is physical and happens in the office; the product’s part is to let its outcome be recorded against the request and to let a correction be raised without starting again. The board places it under following the request rather than under closing it, because verification is something the requester does while the request is still live.</w:t>
+              <w:t xml:space="preserve">Checking what was delivered against what was asked for — the right items, the right quantity, the right room, assembled and working — and doing something about any difference. The check happens physically, in the office. The product’s part is to record what it found and to let a correction be raised without starting over. The board puts it under following the request rather than under closing it, because a requester does this while the request is still live.</w:t>
             </w:r>
           </w:p>
         </w:tc>
@@ -7488,7 +7488,7 @@
                 <w:sz w:val="20"/>
                 <w:szCs w:val="20"/>
               </w:rPr>
-              <w:t xml:space="preserve">Recording that the furniture arrived in the right place, in the right quantity and in working order. It is the requester’s statement rather than the installer’s, and it is what distinguishes work that was done from work that was accepted.</w:t>
+              <w:t xml:space="preserve">Recording that the furniture arrived in the right place, in the right quantity and in working order. It is the requester’s word rather than the installer’s, and it is what separates work that was done from work that was accepted.</w:t>
             </w:r>
           </w:p>
         </w:tc>
@@ -7640,7 +7640,7 @@
                 <w:sz w:val="20"/>
                 <w:szCs w:val="20"/>
               </w:rPr>
-              <w:t xml:space="preserve">Reporting a scope or installation error — wrong floor, wrong item, missing pieces, damage — against the existing request rather than opening a new one, so that the correction inherits the request’s history, its location detail and its conversation. This is Kevin’s scenario, and raising a second request instead is precisely the behaviour that loses the original intent.</w:t>
+              <w:t xml:space="preserve">Reporting a scope or installation error — wrong floor, wrong item, missing pieces, damage — on the existing request rather than opening a new one, so that the correction keeps the request’s history, its location detail and its conversation. This is Kevin’s scenario; raising a second request instead is exactly what loses the original intent.</w:t>
             </w:r>
           </w:p>
         </w:tc>
@@ -7797,7 +7797,7 @@
                 <w:sz w:val="20"/>
                 <w:szCs w:val="20"/>
               </w:rPr>
-              <w:t xml:space="preserve">Bringing the request to a definite end, so that the record shows not only that work happened but that the requester accepted it. Without an explicit close, a request is only ever assumed to be finished and closure becomes an administrative act performed by whoever tidies the queue.</w:t>
+              <w:t xml:space="preserve">Bringing the request to a definite end, so that the record shows not just that the work happened but that the requester accepted it. Without an explicit close, a request is only assumed to be finished, and closing it becomes an administrative act done by whoever tidies the queue.</w:t>
             </w:r>
           </w:p>
         </w:tc>
@@ -7949,7 +7949,7 @@
                 <w:sz w:val="20"/>
                 <w:szCs w:val="20"/>
               </w:rPr>
-              <w:t xml:space="preserve">Stating that the need has been met: the furniture is in place, in the quantity agreed, and the person who reported the problem is working again. This is the only event in the model that can honestly end the requester’s goal, and it is also what makes the closed request trustworthy as a source years later, when a warranty claim or a replacement part depends on it.</w:t>
+              <w:t xml:space="preserve">Saying that the need has been met: the furniture is in place, in the quantity agreed, and the person who reported the problem is working again. It is the only event in the model that can honestly end the requester’s goal, and it is what makes the closed request worth trusting years later, when a warranty claim or a replacement part depends on it.</w:t>
             </w:r>
           </w:p>
         </w:tc>
@@ -8101,7 +8101,7 @@
                 <w:sz w:val="20"/>
                 <w:szCs w:val="20"/>
               </w:rPr>
-              <w:t xml:space="preserve">Recording anything still outstanding at the point of closure — a missing keyboard tray, a damaged panel, one chair short — so that closure is not a way of hiding an unresolved problem. The board makes this a sibling of confirming completion rather than a new request, because the outstanding item belongs to the history of the work that produced it.</w:t>
+              <w:t xml:space="preserve">Recording anything still outstanding when the request closes: a missing keyboard tray, a damaged panel, one chair short. Closure should not be a way of burying an unresolved problem. The board makes this a sibling of confirming completion rather than a new request, because the outstanding item belongs with the work that produced it.</w:t>
             </w:r>
           </w:p>
         </w:tc>
@@ -8144,7 +8144,7 @@
           <w:sz w:val="20"/>
           <w:szCs w:val="20"/>
         </w:rPr>
-        <w:t xml:space="preserve">Four tasks from an earlier draft of this document are not nodes on the board and so are not rows above. Being added to the system as a user is an administrative act performed by someone else. Identifying an origin and a destination is, on the board, two uses of 3.1 to 3.4 rather than a task of its own. Resolving a duplicate request and approving a change of supply path sit on the service staff side, at 1.4 and 2 of the second table, with the requester taking part through 5.5 and 5.6. The history and reporting tasks of that draft — finding an old request, listing active requests, and reporting by location, status or period — are likewise absent from the board; the need behind them survives at 2.5 and 2.6, the two points at which a requester reaches into past requests in order to raise a new one. They are recorded here so that leaving them off the board remains a visible decision rather than an oversight.</w:t>
+        <w:t xml:space="preserve">Four tasks from an earlier draft of this document are not on the board, so they are not rows above. Being added to the system as a user is an administrative act carried out by someone else. Identifying an origin and a destination is, on the board, two uses of 3.1 to 3.4 rather than a task of its own. Resolving a duplicate request and approving a change of supply path sit on the service staff side, at 1.4 and 2 of the second table, with the requester taking part through 5.5 and 5.6. The history and reporting tasks from that draft — finding an old request, listing active requests, reporting by location, status or period — are also absent from the board. What the requester needed them for survives at 2.5 and 2.6, the two points where a requester reaches back into past requests in order to raise a new one. They are noted here so that leaving them off stays a decision someone made rather than something that slipped.</w:t>
       </w:r>
     </w:p>
     <w:p>
@@ -8189,7 +8189,7 @@
           <w:sz w:val="22"/>
           <w:szCs w:val="22"/>
         </w:rPr>
-        <w:t xml:space="preserve">The tasks below correspond to section 4.3 and describe the work of Infrastructure service staff who receive, coordinate and fulfil Furniture Requests. They complete the picture: a request reaches a satisfactory conclusion only if both sets of tasks succeed. The table is numbered and laid out in the same way as the requester table above, so that a task on one side can be read against the task it answers on the other — 5.5 against 1.3, 5.1 against 4.1, 6.1 against 5.1.</w:t>
+        <w:t xml:space="preserve">The tasks below correspond to section 4.3 and cover the work of the Infrastructure staff who receive, coordinate and fulfil Furniture Requests. They complete the picture, because a request only ends well if both sets of tasks succeed. The table is numbered and laid out like the requester table above, so a task on one side can be read against the task it answers on the other: 5.5 against 1.3, 5.1 against 4.1, 6.1 against 5.1.</w:t>
       </w:r>
     </w:p>
     <w:tbl>
@@ -8524,7 +8524,7 @@
                 <w:sz w:val="20"/>
                 <w:szCs w:val="20"/>
               </w:rPr>
-              <w:t xml:space="preserve">The service staff goal: to turn a submitted request into furniture in place, coordinated across whichever Infrastructure groups and external suppliers the work requires, without the request losing coherence as it passes between them.</w:t>
+              <w:t xml:space="preserve">The service staff goal: turning a submitted request into furniture in place, coordinated across whichever Infrastructure groups and outside suppliers the work needs, without the request losing coherence as it passes between them.</w:t>
             </w:r>
           </w:p>
         </w:tc>
@@ -8681,7 +8681,7 @@
                 <w:sz w:val="20"/>
                 <w:szCs w:val="20"/>
               </w:rPr>
-              <w:t xml:space="preserve">Everything between a request arriving and it becoming actionable work. The cost of an incomplete request falls here, which is why so much of the functional specification concerns completeness at submission.</w:t>
+              <w:t xml:space="preserve">Everything between a request arriving and it becoming work someone can act on. The cost of an incomplete request lands here, which is why so much of the functional specification is about completeness at submission.</w:t>
             </w:r>
           </w:p>
         </w:tc>
@@ -8985,7 +8985,7 @@
                 <w:sz w:val="20"/>
                 <w:szCs w:val="20"/>
               </w:rPr>
-              <w:t xml:space="preserve">Deciding whether the request can be progressed as it stands or whether something essential is missing. This judgement requires domain knowledge that the requester does not have.</w:t>
+              <w:t xml:space="preserve">Deciding whether the request can go forward as it stands or whether something essential is missing. That judgement takes domain knowledge the requester does not have.</w:t>
             </w:r>
           </w:p>
         </w:tc>
@@ -9137,7 +9137,7 @@
                 <w:sz w:val="20"/>
                 <w:szCs w:val="20"/>
               </w:rPr>
-              <w:t xml:space="preserve">Obtaining what is missing. Today this happens by email and the answers live in an inbox; the product’s purpose here is to make the exchange part of the request.</w:t>
+              <w:t xml:space="preserve">Getting hold of what is missing. Today this happens by email and the answers sit in an inbox; the point of doing it here is to make the exchange part of the request.</w:t>
             </w:r>
           </w:p>
         </w:tc>
@@ -9289,7 +9289,7 @@
                 <w:sz w:val="20"/>
                 <w:szCs w:val="20"/>
               </w:rPr>
-              <w:t xml:space="preserve">Raising a specific query in a way that is visible to the requester, attached to the request, and available to whoever handles the request next.</w:t>
+              <w:t xml:space="preserve">Raising a specific query where the requester can see it, attached to the request and available to whoever handles the request next.</w:t>
             </w:r>
           </w:p>
         </w:tc>
@@ -9441,7 +9441,7 @@
                 <w:sz w:val="20"/>
                 <w:szCs w:val="20"/>
               </w:rPr>
-              <w:t xml:space="preserve">Determining what form the missing information must take — a marked plan, a photograph, a quantity, an approval — before asking for it.</w:t>
+              <w:t xml:space="preserve">Working out what form the missing information has to take — a marked plan, a photograph, a quantity, an approval — before asking for it.</w:t>
             </w:r>
           </w:p>
         </w:tc>
@@ -9593,7 +9593,7 @@
                 <w:sz w:val="20"/>
                 <w:szCs w:val="20"/>
               </w:rPr>
-              <w:t xml:space="preserve">Recording what was supplied and confirming with the requester that it represents the need correctly, so that the request is agreed before work starts.</w:t>
+              <w:t xml:space="preserve">Recording what was supplied and confirming with the requester that it describes the need correctly, so that the request is agreed before work starts.</w:t>
             </w:r>
           </w:p>
         </w:tc>
@@ -9897,7 +9897,7 @@
                 <w:sz w:val="20"/>
                 <w:szCs w:val="20"/>
               </w:rPr>
-              <w:t xml:space="preserve">Choosing the request that will carry the work forward, normally the earlier or the more complete of the two.</w:t>
+              <w:t xml:space="preserve">Choosing which request carries the work forward, normally the earlier or the more complete of the two.</w:t>
             </w:r>
           </w:p>
         </w:tc>
@@ -10049,7 +10049,7 @@
                 <w:sz w:val="20"/>
                 <w:szCs w:val="20"/>
               </w:rPr>
-              <w:t xml:space="preserve">Ensuring that resolving a duplicate does not discard information, decisions or attachments recorded on either request.</w:t>
+              <w:t xml:space="preserve">Making sure that resolving a duplicate does not throw away information, decisions or attachments recorded on either request.</w:t>
             </w:r>
           </w:p>
         </w:tc>
@@ -10206,7 +10206,7 @@
                 <w:sz w:val="20"/>
                 <w:szCs w:val="20"/>
               </w:rPr>
-              <w:t xml:space="preserve">Establishing the supply path. This decision determines cost, timescale and which groups become involved, and it is the point at which a request commits to the recycled or the new path.</w:t>
+              <w:t xml:space="preserve">Establishing the supply path. This decides cost, timescale and which groups get involved, and it is where a request commits to the recycled route or the new one.</w:t>
             </w:r>
           </w:p>
         </w:tc>
@@ -10358,7 +10358,7 @@
                 <w:sz w:val="20"/>
                 <w:szCs w:val="20"/>
               </w:rPr>
-              <w:t xml:space="preserve">Establishing whether suitable furniture already exists in government stock, honouring the requester’s stated preference where one was given.</w:t>
+              <w:t xml:space="preserve">Establishing whether suitable furniture already exists in government stock, honouring the requester’s stated preference where they gave one.</w:t>
             </w:r>
           </w:p>
         </w:tc>
@@ -10510,7 +10510,7 @@
                 <w:sz w:val="20"/>
                 <w:szCs w:val="20"/>
               </w:rPr>
-              <w:t xml:space="preserve">Concluding that no suitable recycled item exists and that a purchase is required, which moves the request onto the procurement path.</w:t>
+              <w:t xml:space="preserve">Concluding that no suitable recycled item exists and that something has to be bought, which moves the request onto the procurement path.</w:t>
             </w:r>
           </w:p>
         </w:tc>
@@ -10662,7 +10662,7 @@
                 <w:sz w:val="20"/>
                 <w:szCs w:val="20"/>
               </w:rPr>
-              <w:t xml:space="preserve">Capturing the approval and the decision information that accompanies it, so that the authority for the spend is part of the record rather than a separate email.</w:t>
+              <w:t xml:space="preserve">Capturing the approval and the decision information that comes with it, so that the authority for the spend is part of the record rather than a separate email.</w:t>
             </w:r>
           </w:p>
         </w:tc>
@@ -10814,7 +10814,7 @@
                 <w:sz w:val="20"/>
                 <w:szCs w:val="20"/>
               </w:rPr>
-              <w:t xml:space="preserve">Attaching the procurement reference for a furniture purchase to the request, so that the request and the order it generated can be read together without searching the procurement system separately.</w:t>
+              <w:t xml:space="preserve">Attaching the procurement reference for a furniture purchase to the request, so that the request and the order it produced can be read together without going into the procurement system separately.</w:t>
             </w:r>
           </w:p>
         </w:tc>
@@ -10971,7 +10971,7 @@
                 <w:sz w:val="20"/>
                 <w:szCs w:val="20"/>
               </w:rPr>
-              <w:t xml:space="preserve">Moving the request through the several groups and suppliers that carry out the physical work. This is where the problem statement locates the difficulty: the handoffs are where information is lost.</w:t>
+              <w:t xml:space="preserve">Moving the request through the several groups and suppliers that carry out the physical work. This is where the problem statement locates the difficulty: information gets lost at the handoffs.</w:t>
             </w:r>
           </w:p>
         </w:tc>
@@ -11123,7 +11123,7 @@
                 <w:sz w:val="20"/>
                 <w:szCs w:val="20"/>
               </w:rPr>
-              <w:t xml:space="preserve">Establishing explicit ownership, so that the requester and other staff can tell who currently holds the request.</w:t>
+              <w:t xml:space="preserve">Establishing explicit ownership, so that the requester and other staff can tell who is holding the request.</w:t>
             </w:r>
           </w:p>
         </w:tc>
@@ -11275,7 +11275,7 @@
                 <w:sz w:val="20"/>
                 <w:szCs w:val="20"/>
               </w:rPr>
-              <w:t xml:space="preserve">Transferring ownership while keeping the accumulated information, decisions and conversation attached to the request.</w:t>
+              <w:t xml:space="preserve">Passing ownership on while keeping the accumulated information, decisions and conversation attached to the request.</w:t>
             </w:r>
           </w:p>
         </w:tc>
@@ -11427,7 +11427,7 @@
                 <w:sz w:val="20"/>
                 <w:szCs w:val="20"/>
               </w:rPr>
-              <w:t xml:space="preserve">Updating the stage the request has reached, which is what makes status meaningful to the requester rather than nominal.</w:t>
+              <w:t xml:space="preserve">Updating the stage the request has reached, which is what makes status mean something to the requester rather than being nominal.</w:t>
             </w:r>
           </w:p>
         </w:tc>
@@ -11579,7 +11579,7 @@
                 <w:sz w:val="20"/>
                 <w:szCs w:val="20"/>
               </w:rPr>
-              <w:t xml:space="preserve">Reflecting what suppliers and installers are doing, entered by staff rather than by the suppliers themselves, because external parties do not transact in the system.</w:t>
+              <w:t xml:space="preserve">Reflecting what suppliers and installers are doing. Staff enter it rather than the suppliers themselves, because outside parties do not transact in the system.</w:t>
             </w:r>
           </w:p>
         </w:tc>
@@ -11731,7 +11731,7 @@
                 <w:sz w:val="20"/>
                 <w:szCs w:val="20"/>
               </w:rPr>
-              <w:t xml:space="preserve">Setting the date on which the physical work will happen and making it visible to the requester, who often has to arrange access or clear the area.</w:t>
+              <w:t xml:space="preserve">Setting the date the physical work will happen and making it visible to the requester, who often has to arrange access or clear the area.</w:t>
             </w:r>
           </w:p>
         </w:tc>
@@ -11888,7 +11888,7 @@
                 <w:sz w:val="20"/>
                 <w:szCs w:val="20"/>
               </w:rPr>
-              <w:t xml:space="preserve">The service side of the follow-up that the requester is performing. Each of these tasks exists to remove a chase that the requester would otherwise have to make.</w:t>
+              <w:t xml:space="preserve">The service side of the following-up the requester is doing. Each of these tasks exists to remove a chase the requester would otherwise have to make.</w:t>
             </w:r>
           </w:p>
         </w:tc>
@@ -12192,7 +12192,7 @@
                 <w:sz w:val="20"/>
                 <w:szCs w:val="20"/>
               </w:rPr>
-              <w:t xml:space="preserve">Answering questions in the request rather than by separate message, so that the answer is available to everyone who needs it later.</w:t>
+              <w:t xml:space="preserve">Answering questions on the request rather than in a separate message, so that the answer is there for everyone who needs it later.</w:t>
             </w:r>
           </w:p>
         </w:tc>
@@ -12501,7 +12501,7 @@
                 <w:sz w:val="20"/>
                 <w:szCs w:val="20"/>
               </w:rPr>
-              <w:t xml:space="preserve">Finishing the request properly: confirming the outcome, recording why it closed, and making the request available to the reporting that the service is measured by.</w:t>
+              <w:t xml:space="preserve">Finishing the request properly: confirming the outcome, recording why it closed, and making the request available to the reporting the service is measured by.</w:t>
             </w:r>
           </w:p>
         </w:tc>
@@ -12805,7 +12805,7 @@
                 <w:sz w:val="20"/>
                 <w:szCs w:val="20"/>
               </w:rPr>
-              <w:t xml:space="preserve">Capturing the manufacturer, model or serial number of the furniture actually supplied, together with any warranty period or expiry date. This is the task that makes a warranty claim possible years later, and it is done once, by the person who has the information in front of them.</w:t>
+              <w:t xml:space="preserve">Capturing the manufacturer, model or serial number of the furniture actually supplied, together with any warranty period or expiry date. This is what makes a warranty claim possible years later, and it is done once, by the person who has the information in front of them.</w:t>
             </w:r>
           </w:p>
         </w:tc>

</xml_diff>